<commit_message>
fix: removed timestamps from transcribed_focus_groups/ files
</commit_message>
<xml_diff>
--- a/transcribed_focus_groups/chile_grupo_1_raul_perry_17-07-2024.docx
+++ b/transcribed_focus_groups/chile_grupo_1_raul_perry_17-07-2024.docx
@@ -337,7 +337,7 @@
         <w:rPr>
           <w:lang w:val="es-ES"/>
         </w:rPr>
-        <w:t>[00:06] Bueno, entonces, de hecho, justamente la primera pregunta tiene que ver un poco con cómo se relaciona el florecimiento humano, lo que puede sorprender, digamos, el florecimiento humano, con la línea de trabajo de usted y de la Fundación.</w:t>
+        <w:t>Bueno, entonces, de hecho, justamente la primera pregunta tiene que ver un poco con cómo se relaciona el florecimiento humano, lo que puede sorprender, digamos, el florecimiento humano, con la línea de trabajo de usted y de la Fundación.</w:t>
       </w:r>
     </w:p>
     <w:p>
@@ -369,7 +369,7 @@
         <w:rPr>
           <w:lang w:val="es-ES"/>
         </w:rPr>
-        <w:t xml:space="preserve">[00:34] Perfecto. A ver, yo como la </w:t>
+        <w:t xml:space="preserve">Perfecto. A ver, yo como la </w:t>
       </w:r>
       <w:r>
         <w:rPr>
@@ -406,7 +406,7 @@
         <w:rPr>
           <w:lang w:val="es-ES"/>
         </w:rPr>
-        <w:t xml:space="preserve">[01:25] No es que lo aseguremos, es que damos las condiciones para que se dé. Permitimos en el fondo que </w:t>
+        <w:t xml:space="preserve">No es que lo aseguremos, es que damos las condiciones para que se dé. Permitimos en el fondo que </w:t>
       </w:r>
       <w:proofErr w:type="gramStart"/>
       <w:r>
@@ -465,18 +465,18 @@
         <w:jc w:val="both"/>
       </w:pPr>
       <w:r>
-        <w:t>[02:14] para el desarrollo del ser humano, ahí vamos a estar nosotros metidos. Entonces, nosotros entendemos que ese desarrollo positivo en la infancia se da de una determinada manera, que es a través del enfoque preventivo,</w:t>
-      </w:r>
-    </w:p>
-    <w:p>
-      <w:pPr>
-        <w:jc w:val="both"/>
-      </w:pPr>
-      <w:r>
-        <w:rPr>
-          <w:lang w:val="es-ES"/>
-        </w:rPr>
-        <w:t xml:space="preserve">[02:27] que no es un invento nuestro, sino que las ciencias de la prevención tienen programas de doctorados en Estados Unidos y en Chile y probablemente en otros países de Latinoamérica, no existen. </w:t>
+        <w:t>para el desarrollo del ser humano, ahí vamos a estar nosotros metidos. Entonces, nosotros entendemos que ese desarrollo positivo en la infancia se da de una determinada manera, que es a través del enfoque preventivo,</w:t>
+      </w:r>
+    </w:p>
+    <w:p>
+      <w:pPr>
+        <w:jc w:val="both"/>
+      </w:pPr>
+      <w:r>
+        <w:rPr>
+          <w:lang w:val="es-ES"/>
+        </w:rPr>
+        <w:t xml:space="preserve">que no es un invento nuestro, sino que las ciencias de la prevención tienen programas de doctorados en Estados Unidos y en Chile y probablemente en otros países de Latinoamérica, no existen. </w:t>
       </w:r>
       <w:r>
         <w:rPr>
@@ -511,15 +511,15 @@
       </w:pPr>
       <w:r>
         <w:lastRenderedPageBreak/>
-        <w:t>[02:52] suena, que también tiene una carga simbólica bien importante y que lamentablemente también ha establecido muchas confusiones. Hay muchas personas que creen que un programa basado en evidencia es aquel que tiene</w:t>
-      </w:r>
-    </w:p>
-    <w:p>
-      <w:pPr>
-        <w:jc w:val="both"/>
-      </w:pPr>
-      <w:r>
-        <w:t>[03:04] una medición al inicio y una medición al final. Eso no es lo que nosotros entendemos por un programa basado en evidencia. Nosotros entendemos por un programa basado en evidencia</w:t>
+        <w:t>suena, que también tiene una carga simbólica bien importante y que lamentablemente también ha establecido muchas confusiones. Hay muchas personas que creen que un programa basado en evidencia es aquel que tiene</w:t>
+      </w:r>
+    </w:p>
+    <w:p>
+      <w:pPr>
+        <w:jc w:val="both"/>
+      </w:pPr>
+      <w:r>
+        <w:t>una medición al inicio y una medición al final. Eso no es lo que nosotros entendemos por un programa basado en evidencia. Nosotros entendemos por un programa basado en evidencia</w:t>
       </w:r>
       <w:r>
         <w:t xml:space="preserve"> que</w:t>
@@ -536,7 +536,7 @@
         <w:rPr>
           <w:lang w:val="es-ES"/>
         </w:rPr>
-        <w:t xml:space="preserve">[03:20] que cada vez que se implementa, se implementa de la misma manera. </w:t>
+        <w:t xml:space="preserve">que cada vez que se implementa, se implementa de la misma manera. </w:t>
       </w:r>
       <w:proofErr w:type="gramStart"/>
       <w:r>
@@ -573,7 +573,7 @@
         <w:rPr>
           <w:lang w:val="es-ES"/>
         </w:rPr>
-        <w:t xml:space="preserve">[03:48] Lo que significa, en general, no trabajar con ellos, sino trabajar con los adultos que están presentes en los ecosistemas en donde se desarrollan los niños. Pero van a ser ellos, </w:t>
+        <w:t xml:space="preserve">Lo que significa, en general, no trabajar con ellos, sino trabajar con los adultos que están presentes en los ecosistemas en donde se desarrollan los niños. Pero van a ser ellos, </w:t>
       </w:r>
       <w:proofErr w:type="gramStart"/>
       <w:r>
@@ -628,7 +628,7 @@
         <w:jc w:val="both"/>
       </w:pPr>
       <w:r>
-        <w:t>[04:15] Perfecto, me parece muy interesante porque, claro, desde esa mirada del desarrollo positivo de la infancia hay muchos de los temas que</w:t>
+        <w:t>Perfecto, me parece muy interesante porque, claro, desde esa mirada del desarrollo positivo de la infancia hay muchos de los temas que</w:t>
       </w:r>
       <w:r>
         <w:t xml:space="preserve"> acaba</w:t>
@@ -642,7 +642,7 @@
         <w:jc w:val="both"/>
       </w:pPr>
       <w:r>
-        <w:t>[04:26] que hemos tenido con investigadores de la psicología, todo que es muy muy presente un poco nuestra búsqueda de gama inicial de lo que ha aparecido con más fuerza</w:t>
+        <w:t>que hemos tenido con investigadores de la psicología, todo que es muy muy presente un poco nuestra búsqueda de gama inicial de lo que ha aparecido con más fuerza</w:t>
       </w:r>
       <w:r>
         <w:t>,</w:t>
@@ -656,7 +656,7 @@
         <w:jc w:val="both"/>
       </w:pPr>
       <w:r>
-        <w:t>[04:39] menciona el trabajo más a la evidencia en este sentido quería preguntar si han tenido experiencia con proyectos de investigación académica o también de investigación más aplicada que estén relacionados con florecimiento humano, digamos, con esa a</w:t>
+        <w:t>menciona el trabajo más a la evidencia en este sentido quería preguntar si han tenido experiencia con proyectos de investigación académica o también de investigación más aplicada que estén relacionados con florecimiento humano, digamos, con esa a</w:t>
       </w:r>
       <w:r>
         <w:t>mplia</w:t>
@@ -700,7 +700,7 @@
         <w:rPr>
           <w:lang w:val="es-ES"/>
         </w:rPr>
-        <w:t xml:space="preserve">[05:01] A ver, lo que hemos tenido principalmente han sido trabajos académicos vinculados a la adaptación de programas basados en evidencia en el contexto nacional. </w:t>
+        <w:t xml:space="preserve">A ver, lo que hemos tenido principalmente han sido trabajos académicos vinculados a la adaptación de programas basados en evidencia en el contexto nacional. </w:t>
       </w:r>
       <w:r>
         <w:rPr>
@@ -759,7 +759,7 @@
         <w:rPr>
           <w:lang w:val="es-ES"/>
         </w:rPr>
-        <w:t>[05:22] en el fondo que no vamos a salir a buscar</w:t>
+        <w:t>en el fondo que no vamos a salir a buscar</w:t>
       </w:r>
       <w:r>
         <w:rPr>
@@ -796,7 +796,7 @@
         <w:rPr>
           <w:lang w:val="es-ES"/>
         </w:rPr>
-        <w:t>[05:34] hay que reconocer que no es, en general, la investigación que nuestros académicos en el medio nacional buscan. Yo he notado más bien un interés por el desarrollo del nuevo conocimiento. Entonces hay muchos académicos tratando de montar su propio programa</w:t>
+        <w:t>hay que reconocer que no es, en general, la investigación que nuestros académicos en el medio nacional buscan. Yo he notado más bien un interés por el desarrollo del nuevo conocimiento. Entonces hay muchos académicos tratando de montar su propio programa</w:t>
       </w:r>
       <w:r>
         <w:rPr>
@@ -861,7 +861,7 @@
         <w:jc w:val="both"/>
       </w:pPr>
       <w:r>
-        <w:t>[06:20] en torno a la verificación</w:t>
+        <w:t>en torno a la verificación</w:t>
       </w:r>
       <w:r>
         <w:t>,</w:t>
@@ -884,7 +884,7 @@
         <w:rPr>
           <w:lang w:val="es-ES"/>
         </w:rPr>
-        <w:t xml:space="preserve">[06:34] Yo creo </w:t>
+        <w:t xml:space="preserve">Yo creo </w:t>
       </w:r>
       <w:proofErr w:type="gramStart"/>
       <w:r>
@@ -906,7 +906,7 @@
         <w:jc w:val="both"/>
       </w:pPr>
       <w:r>
-        <w:t>[06:47] Sin embargo, existe una crítica constructiva al gremio, una tendencia del mundo académico a querer reinventar el fenómeno. No es solo un problema de los</w:t>
+        <w:t>Sin embargo, existe una crítica constructiva al gremio, una tendencia del mundo académico a querer reinventar el fenómeno. No es solo un problema de los</w:t>
       </w:r>
       <w:r>
         <w:t xml:space="preserve"> </w:t>
@@ -944,7 +944,7 @@
         <w:rPr>
           <w:lang w:val="es-ES"/>
         </w:rPr>
-        <w:t>[07:02] Y aquí en ese sentido, yo, quizá tomando justamente como de esa crítica</w:t>
+        <w:t>Y aquí en ese sentido, yo, quizá tomando justamente como de esa crítica</w:t>
       </w:r>
       <w:r>
         <w:rPr>
@@ -988,7 +988,7 @@
         <w:rPr>
           <w:lang w:val="es-ES"/>
         </w:rPr>
-        <w:t xml:space="preserve">[07:49] </w:t>
+        <w:t xml:space="preserve"/>
       </w:r>
       <w:r>
         <w:rPr>
@@ -1229,23 +1229,23 @@
         <w:jc w:val="both"/>
       </w:pPr>
       <w:r>
-        <w:t>[08:42] Tiene 40 años de investigación. Hay múltiples variantes de PMTO desarrolladas para los más múltiples contextos. Y en general con muy buenos resultados porque los principios que identifica PMTO en la formación parental</w:t>
-      </w:r>
-    </w:p>
-    <w:p>
-      <w:pPr>
-        <w:jc w:val="both"/>
-      </w:pPr>
-      <w:r>
-        <w:t>[08:55] están muy bien mapeados. Entonces, la verdad es que es un privilegio de programa. Tuvimos parte del trabajo pensado con un académico nacional que trabajó con nosotros.</w:t>
-      </w:r>
-    </w:p>
-    <w:p>
-      <w:pPr>
-        <w:jc w:val="both"/>
-      </w:pPr>
-      <w:r>
-        <w:t>[09:10] Sin embargo, él decía pucha, que ustedes se dedican solo a estos programas que vienen con miles de investigaciones. Yo quiero desarrollar el propio. Y nosotros le decíamos, pero para nuestra filosofía de implementadores,</w:t>
+        <w:t>Tiene 40 años de investigación. Hay múltiples variantes de PMTO desarrolladas para los más múltiples contextos. Y en general con muy buenos resultados porque los principios que identifica PMTO en la formación parental</w:t>
+      </w:r>
+    </w:p>
+    <w:p>
+      <w:pPr>
+        <w:jc w:val="both"/>
+      </w:pPr>
+      <w:r>
+        <w:t>están muy bien mapeados. Entonces, la verdad es que es un privilegio de programa. Tuvimos parte del trabajo pensado con un académico nacional que trabajó con nosotros.</w:t>
+      </w:r>
+    </w:p>
+    <w:p>
+      <w:pPr>
+        <w:jc w:val="both"/>
+      </w:pPr>
+      <w:r>
+        <w:t>Sin embargo, él decía pucha, que ustedes se dedican solo a estos programas que vienen con miles de investigaciones. Yo quiero desarrollar el propio. Y nosotros le decíamos, pero para nuestra filosofía de implementadores,</w:t>
       </w:r>
     </w:p>
     <w:p>
@@ -1254,7 +1254,7 @@
       </w:pPr>
       <w:r>
         <w:lastRenderedPageBreak/>
-        <w:t xml:space="preserve">[09:24] ponernos a desarrollar el propio significa fallar mucho. En cambio, a esto nos vamos a la segura y creemos que éticamente es lo que corresponde, si ya tienes algo hecho ¿por qué vas a reinventar la rueda? </w:t>
+        <w:t xml:space="preserve">ponernos a desarrollar el propio significa fallar mucho. En cambio, a esto nos vamos a la segura y creemos que éticamente es lo que corresponde, si ya tienes algo hecho ¿por qué vas a reinventar la rueda? </w:t>
       </w:r>
       <w:r>
         <w:t>E</w:t>
@@ -1277,7 +1277,7 @@
         <w:jc w:val="both"/>
       </w:pPr>
       <w:r>
-        <w:t>[09:43] es una discusión que no sé si como te decía se debe a un problema de diseño de lo que deben hacer los académicos para acreditarse</w:t>
+        <w:t>es una discusión que no sé si como te decía se debe a un problema de diseño de lo que deben hacer los académicos para acreditarse</w:t>
       </w:r>
       <w:r>
         <w:t xml:space="preserve">, </w:t>
@@ -1291,15 +1291,15 @@
         <w:jc w:val="both"/>
       </w:pPr>
       <w:r>
-        <w:t>[09:55] O sea, efectivamente quieren tener la posibilidad de dejar su huella en el diseño de programas y por lo tanto van a priorizar aquellos espacios en donde puedan hacer la investigación desde cero.</w:t>
-      </w:r>
-    </w:p>
-    <w:p>
-      <w:pPr>
-        <w:jc w:val="both"/>
-      </w:pPr>
-      <w:r>
-        <w:t>[10:09] Pero desde la perspectiva de la implementación necesitamos más investigación aplicada, que tome estos programas que ya vienen con todo, o sea, es impresionante el nivel de detalle, trabajo previo, hay un ejemplo que te quiero dar, PMT</w:t>
+        <w:t>O sea, efectivamente quieren tener la posibilidad de dejar su huella en el diseño de programas y por lo tanto van a priorizar aquellos espacios en donde puedan hacer la investigación desde cero.</w:t>
+      </w:r>
+    </w:p>
+    <w:p>
+      <w:pPr>
+        <w:jc w:val="both"/>
+      </w:pPr>
+      <w:r>
+        <w:t>Pero desde la perspectiva de la implementación necesitamos más investigación aplicada, que tome estos programas que ya vienen con todo, o sea, es impresionante el nivel de detalle, trabajo previo, hay un ejemplo que te quiero dar, PMT</w:t>
       </w:r>
       <w:r>
         <w:t>O</w:t>
@@ -1327,7 +1327,7 @@
         <w:jc w:val="both"/>
       </w:pPr>
       <w:r>
-        <w:t>[10:37] un vínculo de deuda por decirlo así</w:t>
+        <w:t>un vínculo de deuda por decirlo así</w:t>
       </w:r>
       <w:r>
         <w:t xml:space="preserve">, del facilitador hacia la </w:t>
@@ -1365,15 +1365,15 @@
         <w:jc w:val="both"/>
       </w:pPr>
       <w:r>
-        <w:t>[11:13] en donde se revisa que estos elementos, que no son solo contenidos, sino que son, por así decirlo en lenguaje médico, excipientes del programa, también estén y se desarrollan en forma apropiada. Y ellos tienen una graduación que permite estadísticamente saber si quienes revisan los videos están dentro de confiabilidad.</w:t>
-      </w:r>
-    </w:p>
-    <w:p>
-      <w:pPr>
-        <w:jc w:val="both"/>
-      </w:pPr>
-      <w:r>
-        <w:t>[11:33] O sea, han hecho ese esfuerzo para estar seguros, no solo que el video es revisado, sino que además que quien revise el video está haciéndolo de la misma manera en Noruega que en Chile.</w:t>
+        <w:t>en donde se revisa que estos elementos, que no son solo contenidos, sino que son, por así decirlo en lenguaje médico, excipientes del programa, también estén y se desarrollan en forma apropiada. Y ellos tienen una graduación que permite estadísticamente saber si quienes revisan los videos están dentro de confiabilidad.</w:t>
+      </w:r>
+    </w:p>
+    <w:p>
+      <w:pPr>
+        <w:jc w:val="both"/>
+      </w:pPr>
+      <w:r>
+        <w:t>O sea, han hecho ese esfuerzo para estar seguros, no solo que el video es revisado, sino que además que quien revise el video está haciéndolo de la misma manera en Noruega que en Chile.</w:t>
       </w:r>
       <w:r>
         <w:t xml:space="preserve"> Entonces, existe un trabajo enorme y por qué entonces insiste nuestro mundo académico en volver a inventar la práctica.   </w:t>
@@ -1405,7 +1405,7 @@
         <w:jc w:val="both"/>
       </w:pPr>
       <w:r>
-        <w:t xml:space="preserve">[11:56] Entonces, yo creo que ahí hay </w:t>
+        <w:t xml:space="preserve">Entonces, yo creo que ahí hay </w:t>
       </w:r>
       <w:r>
         <w:t xml:space="preserve">mucho </w:t>
@@ -1419,15 +1419,15 @@
         <w:jc w:val="both"/>
       </w:pPr>
       <w:r>
-        <w:t>[12:20] es un poco lo que falta para aumentar el beneficio de investigaciones prácticas de preguntar un poco como personas contribuciones que hacen en esta zona académica o aplicada al trabajo de</w:t>
-      </w:r>
-    </w:p>
-    <w:p>
-      <w:pPr>
-        <w:jc w:val="both"/>
-      </w:pPr>
-      <w:r>
-        <w:t xml:space="preserve">[12:33] ustedes y también quizás de otras organizaciones hay quizás </w:t>
+        <w:t>es un poco lo que falta para aumentar el beneficio de investigaciones prácticas de preguntar un poco como personas contribuciones que hacen en esta zona académica o aplicada al trabajo de</w:t>
+      </w:r>
+    </w:p>
+    <w:p>
+      <w:pPr>
+        <w:jc w:val="both"/>
+      </w:pPr>
+      <w:r>
+        <w:t xml:space="preserve">ustedes y también quizás de otras organizaciones hay quizás </w:t>
       </w:r>
       <w:r>
         <w:t>me</w:t>
@@ -1500,47 +1500,47 @@
         <w:jc w:val="both"/>
       </w:pPr>
       <w:r>
-        <w:t>[13:15] Uno de los aportes importantes que hemos observado es el diseño de indicadores y escalas que puedan ser utilizadas en el contexto local.</w:t>
-      </w:r>
-    </w:p>
-    <w:p>
-      <w:pPr>
-        <w:jc w:val="both"/>
-      </w:pPr>
-      <w:r>
-        <w:t>[13:28] Y creo que ahí hay un tema muy interesante, porque efectivamente lo que tenemos muchas veces son escalas no validadas, porque vienen en el fondo del contexto anglosajón, y que tienen preguntas que no necesariamente van a funcionar tan bien en el contexto local.</w:t>
-      </w:r>
-    </w:p>
-    <w:p>
-      <w:pPr>
-        <w:jc w:val="both"/>
-      </w:pPr>
-      <w:r>
-        <w:t>[13:43] Ahí sí hay un tema interesante en torno a las pruebas cognitivas, a todo el desarrollo de validar esos instrumentos para que finalmente sean utilizables. Porque en el fondo uno puede traducir el programa de su cultura,</w:t>
-      </w:r>
-    </w:p>
-    <w:p>
-      <w:pPr>
-        <w:jc w:val="both"/>
-      </w:pPr>
-      <w:r>
-        <w:t>[13:57] pero eso no significa que los instrumentos que están desarrollados para el programa en Estados Unidos vayan a funcionar igualmente bien en Chile. Yo creo que ahí hay un trabajo súper interesante y eso ha sido un gran aporte de la academia</w:t>
-      </w:r>
-    </w:p>
-    <w:p>
-      <w:pPr>
-        <w:jc w:val="both"/>
-      </w:pPr>
-      <w:r>
-        <w:t>[14:08] en el desarrollo de los programas en los cuales trabajamos como fundación. Lo otro también ha sido en el marco de la validación cultural. O sea, cuando hemos trabajado con algunos académicos en Chile,</w:t>
-      </w:r>
-    </w:p>
-    <w:p>
-      <w:pPr>
-        <w:jc w:val="both"/>
-      </w:pPr>
-      <w:r>
-        <w:t xml:space="preserve">[14:21] nos ha servido en el fondo que nos ayuden a sistematizar los desafíos de adaptación cultural a la realidad chilena. Y con eso, en el fondo, hacer que el programa sea válido en </w:t>
+        <w:t>Uno de los aportes importantes que hemos observado es el diseño de indicadores y escalas que puedan ser utilizadas en el contexto local.</w:t>
+      </w:r>
+    </w:p>
+    <w:p>
+      <w:pPr>
+        <w:jc w:val="both"/>
+      </w:pPr>
+      <w:r>
+        <w:t>Y creo que ahí hay un tema muy interesante, porque efectivamente lo que tenemos muchas veces son escalas no validadas, porque vienen en el fondo del contexto anglosajón, y que tienen preguntas que no necesariamente van a funcionar tan bien en el contexto local.</w:t>
+      </w:r>
+    </w:p>
+    <w:p>
+      <w:pPr>
+        <w:jc w:val="both"/>
+      </w:pPr>
+      <w:r>
+        <w:t>Ahí sí hay un tema interesante en torno a las pruebas cognitivas, a todo el desarrollo de validar esos instrumentos para que finalmente sean utilizables. Porque en el fondo uno puede traducir el programa de su cultura,</w:t>
+      </w:r>
+    </w:p>
+    <w:p>
+      <w:pPr>
+        <w:jc w:val="both"/>
+      </w:pPr>
+      <w:r>
+        <w:t>pero eso no significa que los instrumentos que están desarrollados para el programa en Estados Unidos vayan a funcionar igualmente bien en Chile. Yo creo que ahí hay un trabajo súper interesante y eso ha sido un gran aporte de la academia</w:t>
+      </w:r>
+    </w:p>
+    <w:p>
+      <w:pPr>
+        <w:jc w:val="both"/>
+      </w:pPr>
+      <w:r>
+        <w:t>en el desarrollo de los programas en los cuales trabajamos como fundación. Lo otro también ha sido en el marco de la validación cultural. O sea, cuando hemos trabajado con algunos académicos en Chile,</w:t>
+      </w:r>
+    </w:p>
+    <w:p>
+      <w:pPr>
+        <w:jc w:val="both"/>
+      </w:pPr>
+      <w:r>
+        <w:t xml:space="preserve">nos ha servido en el fondo que nos ayuden a sistematizar los desafíos de adaptación cultural a la realidad chilena. Y con eso, en el fondo, hacer que el programa sea válido en </w:t>
       </w:r>
       <w:r>
         <w:t>C</w:t>
@@ -1591,15 +1591,15 @@
         <w:jc w:val="both"/>
       </w:pPr>
       <w:r>
-        <w:t>[14:56] sino básicamente la experiencia de hacer adaptación cultural, científica, ordenada, metodológica, es muy valiosa. Así que yo creo que en esos espacios ha sido muy importante. Hemos tenido también algunos diseños de</w:t>
-      </w:r>
-    </w:p>
-    <w:p>
-      <w:pPr>
-        <w:jc w:val="both"/>
-      </w:pPr>
-      <w:r>
-        <w:t>[15:10] evaluaciones experimentales de los programas adaptados a Chile, y también ha sido importante contar con la ayuda de los académicos. Ahora, también siendo muy honesto,</w:t>
+        <w:t>sino básicamente la experiencia de hacer adaptación cultural, científica, ordenada, metodológica, es muy valiosa. Así que yo creo que en esos espacios ha sido muy importante. Hemos tenido también algunos diseños de</w:t>
+      </w:r>
+    </w:p>
+    <w:p>
+      <w:pPr>
+        <w:jc w:val="both"/>
+      </w:pPr>
+      <w:r>
+        <w:t>evaluaciones experimentales de los programas adaptados a Chile, y también ha sido importante contar con la ayuda de los académicos. Ahora, también siendo muy honesto,</w:t>
       </w:r>
       <w:r>
         <w:t xml:space="preserve"> </w:t>
@@ -1637,7 +1637,7 @@
         <w:jc w:val="both"/>
       </w:pPr>
       <w:r>
-        <w:t>[16:04] pero el diseño</w:t>
+        <w:t>pero el diseño</w:t>
       </w:r>
       <w:r>
         <w:t xml:space="preserve">, </w:t>
@@ -1659,7 +1659,7 @@
         <w:jc w:val="both"/>
       </w:pPr>
       <w:r>
-        <w:t>[16:18] Al final, el mundo se volvió muy pequeño después de la pandemia.</w:t>
+        <w:t>Al final, el mundo se volvió muy pequeño después de la pandemia.</w:t>
       </w:r>
     </w:p>
     <w:p>
@@ -1688,7 +1688,7 @@
         <w:jc w:val="both"/>
       </w:pPr>
       <w:r>
-        <w:t xml:space="preserve">[16:37] Perfecto. De nuevo, sigo la pregunta porque creo que </w:t>
+        <w:t xml:space="preserve">Perfecto. De nuevo, sigo la pregunta porque creo que </w:t>
       </w:r>
       <w:r>
         <w:t xml:space="preserve">algunos de los temas han ido apareciendo en la conversación y considerando un poco la experiencia que tienen y que han tenido, me parece interesante como lo han desarrollado en ciudades locales como también de a fuera. </w:t>
@@ -1703,7 +1703,7 @@
       </w:pPr>
       <w:r>
         <w:lastRenderedPageBreak/>
-        <w:t>[16:58] estarían interesados en relacionarse con la investigación sobre florecimiento humano. ¿Qué tipo de relación ven ahí que se podría generar y estarían interesados en desarrollar?</w:t>
+        <w:t>estarían interesados en relacionarse con la investigación sobre florecimiento humano. ¿Qué tipo de relación ven ahí que se podría generar y estarían interesados en desarrollar?</w:t>
       </w:r>
     </w:p>
     <w:p>
@@ -1732,7 +1732,7 @@
         <w:jc w:val="both"/>
       </w:pPr>
       <w:r>
-        <w:t xml:space="preserve">[17:13] Es difícil, ¿eh? Yo encuentro que lo primero es que el concepto es interesante, pero las fundaciones están todavía muy vinculadas al concepto de calidad de vida. Es como aún sigue siendo, a mi parecer, uno de los elementos más presentes en las misiones de las organizaciones. </w:t>
+        <w:t xml:space="preserve">Es difícil, ¿eh? Yo encuentro que lo primero es que el concepto es interesante, pero las fundaciones están todavía muy vinculadas al concepto de calidad de vida. Es como aún sigue siendo, a mi parecer, uno de los elementos más presentes en las misiones de las organizaciones. </w:t>
       </w:r>
       <w:r>
         <w:t>A</w:t>
@@ -1758,7 +1758,7 @@
         <w:jc w:val="both"/>
       </w:pPr>
       <w:r>
-        <w:t>[17:40] las cosas que le exigía un directorio se las pedí no se</w:t>
+        <w:t>las cosas que le exigía un directorio se las pedí no se</w:t>
       </w:r>
       <w:r>
         <w:t xml:space="preserve"> la</w:t>
@@ -1788,21 +1788,99 @@
         <w:jc w:val="both"/>
       </w:pPr>
       <w:r>
-        <w:t>[17:57] Y eso en el fondo creo yo que sería un escalón lógico en el desarrollo del concepto que ustedes están poniendo al hablar de florecimiento humano. Pero todavía no hemos llegado ahí.</w:t>
-      </w:r>
-    </w:p>
-    <w:p>
-      <w:pPr>
-        <w:jc w:val="both"/>
-      </w:pPr>
-      <w:r>
-        <w:t>[18:09]</w:t>
+        <w:t>Y eso en el fondo creo yo que sería un escalón lógico en el desarrollo del concepto que ustedes están poniendo al hablar de florecimiento humano. Pero todavía no hemos llegado ahí.</w:t>
+      </w:r>
+    </w:p>
+    <w:p>
+      <w:pPr>
+        <w:jc w:val="both"/>
+      </w:pPr>
+      <w:r>
+        <w:t/>
+      </w:r>
+      <w:r>
+        <w:t xml:space="preserve"/>
+      </w:r>
+      <w:r>
+        <w:t>Entonces, de ahí a que las organizaciones estén dispuestas a financiar investigación para ello, estamos un poco más lejos. Y eso yo lo veo como un obstáculo.</w:t>
+      </w:r>
+    </w:p>
+    <w:p>
+      <w:pPr>
+        <w:jc w:val="both"/>
+      </w:pPr>
+    </w:p>
+    <w:p>
+      <w:pPr>
+        <w:jc w:val="both"/>
+        <w:rPr>
+          <w:b/>
+          <w:bCs/>
+        </w:rPr>
+      </w:pPr>
+      <w:r>
+        <w:rPr>
+          <w:b/>
+          <w:bCs/>
+        </w:rPr>
+        <w:t>Giovanni</w:t>
+      </w:r>
+    </w:p>
+    <w:p>
+      <w:pPr>
+        <w:jc w:val="both"/>
+      </w:pPr>
+      <w:r>
+        <w:t>¿Y hay alguna organización pública o privada, alguna persona que conozca que ahora o también el pasado haya apoyado investigación</w:t>
+      </w:r>
+      <w:r>
+        <w:t>,</w:t>
+      </w:r>
+      <w:r>
+        <w:t xml:space="preserve"> de nuevo sobre algún aspecto tenga que ver con florecimiento humano</w:t>
+      </w:r>
+      <w:r>
+        <w:t>,</w:t>
+      </w:r>
+      <w:r>
+        <w:t xml:space="preserve"> pero bueno me parece interesante es un poco también lo que mencionaríamos respecto a</w:t>
+      </w:r>
+    </w:p>
+    <w:p>
+      <w:pPr>
+        <w:jc w:val="both"/>
+      </w:pPr>
+      <w:r>
+        <w:t>la conversación muy grande en lo que es l</w:t>
+      </w:r>
+      <w:r>
+        <w:t>a</w:t>
+      </w:r>
+      <w:r>
+        <w:t xml:space="preserve"> investigación aplicada</w:t>
+      </w:r>
+      <w:r>
+        <w:t>,</w:t>
+      </w:r>
+      <w:r>
+        <w:t xml:space="preserve"> la evidencia de </w:t>
+      </w:r>
+      <w:proofErr w:type="gramStart"/>
+      <w:r>
+        <w:t>programas</w:t>
+      </w:r>
+      <w:proofErr w:type="gramEnd"/>
+      <w:r>
+        <w:t xml:space="preserve"> pero también un poco ese tema conceptual que también es relevante y orienta el</w:t>
       </w:r>
       <w:r>
         <w:t xml:space="preserve"> </w:t>
       </w:r>
       <w:r>
-        <w:t>Entonces, de ahí a que las organizaciones estén dispuestas a financiar investigación para ello, estamos un poco más lejos. Y eso yo lo veo como un obstáculo.</w:t>
+        <w:t>trabajo de una organización de una manera u otra y que es interesante que se descarga un poco más</w:t>
+      </w:r>
+      <w:r>
+        <w:t xml:space="preserve"> conceptual. </w:t>
       </w:r>
     </w:p>
     <w:p>
@@ -1831,122 +1909,44 @@
         <w:jc w:val="both"/>
       </w:pPr>
       <w:r>
-        <w:t>[18:25] ¿Y hay alguna organización pública o privada, alguna persona que conozca que ahora o también el pasado haya apoyado investigación</w:t>
+        <w:t>Yo creo que hemos tocado, pregunto igual a Hugo también, que me confirme, pero creo que hemos tocado un poco todos los puntos que teníamos ahí</w:t>
+      </w:r>
+      <w:r>
+        <w:t xml:space="preserve">. </w:t>
+      </w:r>
+    </w:p>
+    <w:p>
+      <w:pPr>
+        <w:jc w:val="both"/>
+      </w:pPr>
+    </w:p>
+    <w:p>
+      <w:pPr>
+        <w:jc w:val="both"/>
+        <w:rPr>
+          <w:b/>
+          <w:bCs/>
+        </w:rPr>
+      </w:pPr>
+      <w:r>
+        <w:rPr>
+          <w:b/>
+          <w:bCs/>
+        </w:rPr>
+        <w:t>Hugo</w:t>
+      </w:r>
+    </w:p>
+    <w:p>
+      <w:pPr>
+        <w:jc w:val="both"/>
+      </w:pPr>
+      <w:r>
+        <w:t>Pues</w:t>
       </w:r>
       <w:r>
         <w:t>,</w:t>
       </w:r>
       <w:r>
-        <w:t xml:space="preserve"> de nuevo sobre algún aspecto tenga que ver con florecimiento humano</w:t>
-      </w:r>
-      <w:r>
-        <w:t>,</w:t>
-      </w:r>
-      <w:r>
-        <w:t xml:space="preserve"> pero bueno me parece interesante es un poco también lo que mencionaríamos respecto a</w:t>
-      </w:r>
-    </w:p>
-    <w:p>
-      <w:pPr>
-        <w:jc w:val="both"/>
-      </w:pPr>
-      <w:r>
-        <w:t>[18:54] la conversación muy grande en lo que es l</w:t>
-      </w:r>
-      <w:r>
-        <w:t>a</w:t>
-      </w:r>
-      <w:r>
-        <w:t xml:space="preserve"> investigación aplicada</w:t>
-      </w:r>
-      <w:r>
-        <w:t>,</w:t>
-      </w:r>
-      <w:r>
-        <w:t xml:space="preserve"> la evidencia de </w:t>
-      </w:r>
-      <w:proofErr w:type="gramStart"/>
-      <w:r>
-        <w:t>programas</w:t>
-      </w:r>
-      <w:proofErr w:type="gramEnd"/>
-      <w:r>
-        <w:t xml:space="preserve"> pero también un poco ese tema conceptual que también es relevante y orienta el</w:t>
-      </w:r>
-      <w:r>
-        <w:t xml:space="preserve"> </w:t>
-      </w:r>
-      <w:r>
-        <w:t>trabajo de una organización de una manera u otra y que es interesante que se descarga un poco más</w:t>
-      </w:r>
-      <w:r>
-        <w:t xml:space="preserve"> conceptual. </w:t>
-      </w:r>
-    </w:p>
-    <w:p>
-      <w:pPr>
-        <w:jc w:val="both"/>
-      </w:pPr>
-    </w:p>
-    <w:p>
-      <w:pPr>
-        <w:jc w:val="both"/>
-        <w:rPr>
-          <w:b/>
-          <w:bCs/>
-        </w:rPr>
-      </w:pPr>
-      <w:r>
-        <w:rPr>
-          <w:b/>
-          <w:bCs/>
-        </w:rPr>
-        <w:t>Giovanni</w:t>
-      </w:r>
-    </w:p>
-    <w:p>
-      <w:pPr>
-        <w:jc w:val="both"/>
-      </w:pPr>
-      <w:r>
-        <w:t>[20:12] Yo creo que hemos tocado, pregunto igual a Hugo también, que me confirme, pero creo que hemos tocado un poco todos los puntos que teníamos ahí</w:t>
-      </w:r>
-      <w:r>
-        <w:t xml:space="preserve">. </w:t>
-      </w:r>
-    </w:p>
-    <w:p>
-      <w:pPr>
-        <w:jc w:val="both"/>
-      </w:pPr>
-    </w:p>
-    <w:p>
-      <w:pPr>
-        <w:jc w:val="both"/>
-        <w:rPr>
-          <w:b/>
-          <w:bCs/>
-        </w:rPr>
-      </w:pPr>
-      <w:r>
-        <w:rPr>
-          <w:b/>
-          <w:bCs/>
-        </w:rPr>
-        <w:t>Hugo</w:t>
-      </w:r>
-    </w:p>
-    <w:p>
-      <w:pPr>
-        <w:jc w:val="both"/>
-      </w:pPr>
-      <w:r>
-        <w:t>Pues</w:t>
-      </w:r>
-      <w:r>
-        <w:t>,</w:t>
-      </w:r>
-      <w:r>
         <w:t xml:space="preserve"> yo solo quisiera indagar y preguntarle al entrevistado al Dr. </w:t>
       </w:r>
       <w:r>
@@ -1979,7 +1979,7 @@
         <w:jc w:val="both"/>
       </w:pPr>
       <w:r>
-        <w:t>[20:25] A ver, dicho en forma amplia, pero realmente hay una gran parte de las organizaciones en Chile que se dedican a pensar en florecimiento humano, pero voy a tratar de hacer mi propia</w:t>
+        <w:t>A ver, dicho en forma amplia, pero realmente hay una gran parte de las organizaciones en Chile que se dedican a pensar en florecimiento humano, pero voy a tratar de hacer mi propia</w:t>
       </w:r>
       <w:r>
         <w:t xml:space="preserve"> </w:t>
@@ -2019,7 +2019,7 @@
         <w:jc w:val="both"/>
       </w:pPr>
       <w:r>
-        <w:t>[21:13] fomentar el desarrollo una trayectoria sana de desarrollo o de búsqueda de realizaciones</w:t>
+        <w:t>fomentar el desarrollo una trayectoria sana de desarrollo o de búsqueda de realizaciones</w:t>
       </w:r>
       <w:r>
         <w:t>,</w:t>
@@ -2078,7 +2078,7 @@
         <w:jc w:val="both"/>
       </w:pPr>
       <w:r>
-        <w:t xml:space="preserve">[22:13] había que desarrollar los niños con presión lectora cosa que me resulta profundamente difícil de tragar por no decir </w:t>
+        <w:t xml:space="preserve">había que desarrollar los niños con presión lectora cosa que me resulta profundamente difícil de tragar por no decir </w:t>
       </w:r>
       <w:proofErr w:type="gramStart"/>
       <w:r>
@@ -2094,15 +2094,15 @@
         <w:jc w:val="both"/>
       </w:pPr>
       <w:r>
-        <w:t>[22:30] y hay muchas organizaciones que están trabajando en el desarrollo de currículum socio emocionales para educación preescolar y educación básica y yo diría que hay una componente de florecimiento humano muy interesante desde la</w:t>
-      </w:r>
-    </w:p>
-    <w:p>
-      <w:pPr>
-        <w:jc w:val="both"/>
-      </w:pPr>
-      <w:r>
-        <w:t>[22:44] perspectiva lo que está tratando como de conceptualizar de una mirada más bien preventiv</w:t>
+        <w:t>y hay muchas organizaciones que están trabajando en el desarrollo de currículum socio emocionales para educación preescolar y educación básica y yo diría que hay una componente de florecimiento humano muy interesante desde la</w:t>
+      </w:r>
+    </w:p>
+    <w:p>
+      <w:pPr>
+        <w:jc w:val="both"/>
+      </w:pPr>
+      <w:r>
+        <w:t>perspectiva lo que está tratando como de conceptualizar de una mirada más bien preventiv</w:t>
       </w:r>
       <w:r>
         <w:t>a</w:t>
@@ -2122,7 +2122,7 @@
         <w:jc w:val="both"/>
       </w:pPr>
       <w:r>
-        <w:t>[23:13] qué es lo que quieres educar en los colegios. Entonces yo diría que ahí hay dos ámbitos que en Chile son muy fuertes, no tan fuertes en otros temas preventivos, pero al menos sí muy fuertes en</w:t>
+        <w:t>qué es lo que quieres educar en los colegios. Entonces yo diría que ahí hay dos ámbitos que en Chile son muy fuertes, no tan fuertes en otros temas preventivos, pero al menos sí muy fuertes en</w:t>
       </w:r>
       <w:r>
         <w:t xml:space="preserve"> </w:t>
@@ -2142,7 +2142,7 @@
         <w:jc w:val="both"/>
       </w:pPr>
       <w:r>
-        <w:t xml:space="preserve">[23:38] con una organización que se llama el programa haciendo escuela que lo desarrolla la </w:t>
+        <w:t xml:space="preserve">con una organización que se llama el programa haciendo escuela que lo desarrolla la </w:t>
       </w:r>
       <w:r>
         <w:rPr>
@@ -2179,7 +2179,7 @@
         <w:jc w:val="both"/>
       </w:pPr>
       <w:r>
-        <w:t xml:space="preserve">[23:50] de programas de lectoescritura y de desarrollo socioemocional. Entonces es interesante porque ahí hay un conjunto de programas que fueron también mirados por la Fundación San Carlos de Maipo como programas que podían contribuir al </w:t>
+        <w:t xml:space="preserve">de programas de lectoescritura y de desarrollo socioemocional. Entonces es interesante porque ahí hay un conjunto de programas que fueron también mirados por la Fundación San Carlos de Maipo como programas que podían contribuir al </w:t>
       </w:r>
       <w:r>
         <w:rPr>
@@ -2194,7 +2194,7 @@
         <w:jc w:val="both"/>
       </w:pPr>
       <w:r>
-        <w:t>[24:05] y se hizo con una selección de aquellos que tenían mayor nivel de evidencia o de construcción al menos. Entonces, creo que ese programa y ese contacto puede ser interesante porque ustedes puedan ver otras instituciones que están mirando estos temas de florecimiento</w:t>
+        <w:t>y se hizo con una selección de aquellos que tenían mayor nivel de evidencia o de construcción al menos. Entonces, creo que ese programa y ese contacto puede ser interesante porque ustedes puedan ver otras instituciones que están mirando estos temas de florecimiento</w:t>
       </w:r>
       <w:r>
         <w:t xml:space="preserve"> </w:t>
@@ -2244,7 +2244,7 @@
         <w:jc w:val="both"/>
       </w:pPr>
       <w:r>
-        <w:t>[24:34] Perfecto. Mencionó que se llama el programa Haciendo Escuela y la fundación Falabella.</w:t>
+        <w:t>Perfecto. Mencionó que se llama el programa Haciendo Escuela y la fundación Falabella.</w:t>
       </w:r>
     </w:p>
     <w:p>
@@ -2273,7 +2273,7 @@
         <w:jc w:val="both"/>
       </w:pPr>
       <w:r>
-        <w:t>[24:35] Sí.</w:t>
+        <w:t>Sí.</w:t>
       </w:r>
     </w:p>
     <w:p>
@@ -2302,7 +2302,7 @@
         <w:jc w:val="both"/>
       </w:pPr>
       <w:r>
-        <w:t>[24:42] Ok. ¿Tiene en mente alguna otra fundación o algún otro programa?</w:t>
+        <w:t>Ok. ¿Tiene en mente alguna otra fundación o algún otro programa?</w:t>
       </w:r>
     </w:p>
     <w:p>
@@ -2331,7 +2331,7 @@
         <w:jc w:val="both"/>
       </w:pPr>
       <w:r>
-        <w:t xml:space="preserve">[24:52] En este minuto no. No, porque el resto del tiempo empezamos a entrar en otros espacios que yo siento no son necesariamente de florecimiento humano. No sé si yo hablo, por ejemplo, adulto mayor, el problema de las residencias de niños que están bajo custodia del Estado, que en el fondo en Chile es conocido como el </w:t>
+        <w:t xml:space="preserve">En este minuto no. No, porque el resto del tiempo empezamos a entrar en otros espacios que yo siento no son necesariamente de florecimiento humano. No sé si yo hablo, por ejemplo, adulto mayor, el problema de las residencias de niños que están bajo custodia del Estado, que en el fondo en Chile es conocido como el </w:t>
       </w:r>
       <w:r>
         <w:rPr>
@@ -2390,7 +2390,7 @@
         <w:jc w:val="both"/>
       </w:pPr>
       <w:r>
-        <w:t xml:space="preserve">[25:06] están en el marco más reparatorio de niños que han sido vulnerados en sus derechos, su trabajo es distinto seamos la </w:t>
+        <w:t xml:space="preserve">están en el marco más reparatorio de niños que han sido vulnerados en sus derechos, su trabajo es distinto seamos la </w:t>
       </w:r>
       <w:r>
         <w:t>SE</w:t>
@@ -2434,7 +2434,7 @@
         <w:jc w:val="both"/>
       </w:pPr>
       <w:r>
-        <w:t xml:space="preserve">[25:34] Sí, efectivamente he visto muchas de las fundaciones también muy grandes que tienen varios programas educacionales, con </w:t>
+        <w:t xml:space="preserve">Sí, efectivamente he visto muchas de las fundaciones también muy grandes que tienen varios programas educacionales, con </w:t>
       </w:r>
       <w:r>
         <w:rPr>
@@ -2468,15 +2468,15 @@
         <w:jc w:val="both"/>
       </w:pPr>
       <w:r>
-        <w:t>[25:48] digamos encontrar un contacto como directo porque eso no ha sido muy fácil digamos, ha sido fácil encontrar organización relevante pero difícil</w:t>
-      </w:r>
-    </w:p>
-    <w:p>
-      <w:pPr>
-        <w:jc w:val="both"/>
-      </w:pPr>
-      <w:r>
-        <w:t>[26:01] dar un nombre o un apellido a la persona que pudiera un poco comentar algo</w:t>
+        <w:t>digamos encontrar un contacto como directo porque eso no ha sido muy fácil digamos, ha sido fácil encontrar organización relevante pero difícil</w:t>
+      </w:r>
+    </w:p>
+    <w:p>
+      <w:pPr>
+        <w:jc w:val="both"/>
+      </w:pPr>
+      <w:r>
+        <w:t>dar un nombre o un apellido a la persona que pudiera un poco comentar algo</w:t>
       </w:r>
       <w:r>
         <w:t>.</w:t>
@@ -2508,7 +2508,7 @@
         <w:jc w:val="both"/>
       </w:pPr>
       <w:r>
-        <w:t xml:space="preserve">[26:05] </w:t>
+        <w:t xml:space="preserve"/>
       </w:r>
       <w:r>
         <w:t xml:space="preserve">Bien, </w:t>
@@ -2536,7 +2536,7 @@
         <w:jc w:val="both"/>
       </w:pPr>
       <w:r>
-        <w:t xml:space="preserve">[26:19] Entonces estamos en contacto con varias de estas organizaciones. Y además también somos parte del directorio de una organización que se llama </w:t>
+        <w:t xml:space="preserve">Entonces estamos en contacto con varias de estas organizaciones. Y además también somos parte del directorio de una organización que se llama </w:t>
       </w:r>
       <w:r>
         <w:rPr>
@@ -2553,7 +2553,7 @@
         <w:jc w:val="both"/>
       </w:pPr>
       <w:r>
-        <w:t>[26:31] Y ahí participan un montón de estas organizaciones que estamos hablando</w:t>
+        <w:t>Y ahí participan un montón de estas organizaciones que estamos hablando</w:t>
       </w:r>
       <w:r>
         <w:t xml:space="preserve">, </w:t>
@@ -2591,15 +2591,15 @@
         <w:jc w:val="both"/>
       </w:pPr>
       <w:r>
-        <w:t>[26:40] Sí, el público creo que no se la tenían en realidad efectivamente no pero claro, ahí cualquier contacto en el sentido</w:t>
-      </w:r>
-    </w:p>
-    <w:p>
-      <w:pPr>
-        <w:jc w:val="both"/>
-      </w:pPr>
-      <w:r>
-        <w:t xml:space="preserve">[26:51] sería súper útil </w:t>
+        <w:t>Sí, el público creo que no se la tenían en realidad efectivamente no pero claro, ahí cualquier contacto en el sentido</w:t>
+      </w:r>
+    </w:p>
+    <w:p>
+      <w:pPr>
+        <w:jc w:val="both"/>
+      </w:pPr>
+      <w:r>
+        <w:t xml:space="preserve">sería súper útil </w:t>
       </w:r>
       <w:r>
         <w:t xml:space="preserve">y </w:t>
@@ -2622,7 +2622,7 @@
       </w:pPr>
       <w:r>
         <w:lastRenderedPageBreak/>
-        <w:t>[27:04] tienen y eso la mirada específica sobre la investigación que creo que es muy clara respecto a lo que digamos lo que pueden ser los aportes lo que su quehacer como posible relación operaciones más bien</w:t>
+        <w:t>tienen y eso la mirada específica sobre la investigación que creo que es muy clara respecto a lo que digamos lo que pueden ser los aportes lo que su quehacer como posible relación operaciones más bien</w:t>
       </w:r>
       <w:r>
         <w:t xml:space="preserve">. </w:t>
@@ -2633,7 +2633,7 @@
         <w:jc w:val="both"/>
       </w:pPr>
       <w:r>
-        <w:t xml:space="preserve">[27:20] </w:t>
+        <w:t xml:space="preserve"/>
       </w:r>
       <w:r>
         <w:t>M</w:t>

</xml_diff>